<commit_message>
feat(anydoor): stripe integration, notion layer updates, anydoor engine (door #2 url assessment and tap to talk built/fixed)
Made-with: Cursor
</commit_message>
<xml_diff>
--- a/docs/socialutely-live-door-links.docx
+++ b/docs/socialutely-live-door-links.docx
@@ -787,14 +787,878 @@
     <w:p>
       <w:pPr>
         <w:spacing w:after="120"/>
-      </w:pPr>
-      <w:r>
         <w:rPr>
           <w:i/>
           <w:iCs/>
         </w:rPr>
+      </w:pPr>
+      <w:r>
+        <w:rPr>
+          <w:i/>
+          <w:iCs/>
+        </w:rPr>
         <w:t>Generated for Word / Notion. CMS “live” badge may differ from deployable routes.</w:t>
       </w:r>
+    </w:p>
+    <w:p>
+      <w:pPr>
+        <w:spacing w:after="120"/>
+        <w:rPr>
+          <w:i/>
+          <w:iCs/>
+        </w:rPr>
+      </w:pPr>
+    </w:p>
+    <w:p>
+      <w:pPr>
+        <w:spacing w:after="120"/>
+        <w:rPr>
+          <w:i/>
+          <w:iCs/>
+        </w:rPr>
+      </w:pPr>
+    </w:p>
+    <w:p>
+      <w:pPr>
+        <w:spacing w:after="120"/>
+        <w:rPr>
+          <w:i/>
+          <w:iCs/>
+        </w:rPr>
+      </w:pPr>
+    </w:p>
+    <w:p>
+      <w:pPr>
+        <w:spacing w:after="120"/>
+        <w:rPr>
+          <w:i/>
+          <w:iCs/>
+        </w:rPr>
+      </w:pPr>
+    </w:p>
+    <w:p>
+      <w:pPr>
+        <w:spacing w:after="120"/>
+        <w:rPr>
+          <w:i/>
+          <w:iCs/>
+        </w:rPr>
+      </w:pPr>
+    </w:p>
+    <w:p>
+      <w:pPr>
+        <w:spacing w:after="120"/>
+        <w:rPr>
+          <w:i/>
+          <w:iCs/>
+        </w:rPr>
+      </w:pPr>
+    </w:p>
+    <w:p>
+      <w:pPr>
+        <w:spacing w:after="120"/>
+        <w:rPr>
+          <w:i/>
+          <w:iCs/>
+        </w:rPr>
+      </w:pPr>
+    </w:p>
+    <w:p>
+      <w:pPr>
+        <w:spacing w:after="120"/>
+        <w:rPr>
+          <w:i/>
+          <w:iCs/>
+        </w:rPr>
+      </w:pPr>
+    </w:p>
+    <w:p>
+      <w:pPr>
+        <w:spacing w:after="120"/>
+        <w:rPr>
+          <w:i/>
+          <w:iCs/>
+        </w:rPr>
+      </w:pPr>
+    </w:p>
+    <w:p>
+      <w:pPr>
+        <w:spacing w:after="120"/>
+        <w:rPr>
+          <w:i/>
+          <w:iCs/>
+        </w:rPr>
+      </w:pPr>
+    </w:p>
+    <w:p>
+      <w:pPr>
+        <w:spacing w:after="120"/>
+        <w:rPr>
+          <w:i/>
+          <w:iCs/>
+        </w:rPr>
+      </w:pPr>
+    </w:p>
+    <w:p>
+      <w:pPr>
+        <w:spacing w:after="120"/>
+        <w:rPr>
+          <w:i/>
+          <w:iCs/>
+        </w:rPr>
+      </w:pPr>
+    </w:p>
+    <w:p>
+      <w:pPr>
+        <w:spacing w:after="120"/>
+        <w:rPr>
+          <w:i/>
+          <w:iCs/>
+        </w:rPr>
+      </w:pPr>
+    </w:p>
+    <w:p>
+      <w:pPr>
+        <w:spacing w:after="120"/>
+        <w:rPr>
+          <w:i/>
+          <w:iCs/>
+        </w:rPr>
+      </w:pPr>
+    </w:p>
+    <w:p>
+      <w:pPr>
+        <w:spacing w:after="120"/>
+        <w:rPr>
+          <w:i/>
+          <w:iCs/>
+        </w:rPr>
+      </w:pPr>
+    </w:p>
+    <w:p>
+      <w:pPr>
+        <w:spacing w:after="120"/>
+        <w:rPr>
+          <w:i/>
+          <w:iCs/>
+        </w:rPr>
+      </w:pPr>
+    </w:p>
+    <w:p>
+      <w:pPr>
+        <w:spacing w:after="120"/>
+        <w:rPr>
+          <w:b/>
+          <w:bCs/>
+        </w:rPr>
+      </w:pPr>
+      <w:r>
+        <w:rPr>
+          <w:b/>
+          <w:bCs/>
+        </w:rPr>
+        <w:lastRenderedPageBreak/>
+        <w:t>PARTNER BRIEF DIRECTORY</w:t>
+      </w:r>
+    </w:p>
+    <w:p>
+      <w:pPr>
+        <w:spacing w:after="120"/>
+        <w:rPr>
+          <w:b/>
+          <w:bCs/>
+        </w:rPr>
+      </w:pPr>
+    </w:p>
+    <w:p>
+      <w:pPr>
+        <w:spacing w:after="120"/>
+        <w:rPr>
+          <w:b/>
+          <w:bCs/>
+        </w:rPr>
+      </w:pPr>
+      <w:r>
+        <w:rPr>
+          <w:b/>
+          <w:bCs/>
+        </w:rPr>
+        <w:t xml:space="preserve">-- </w:t>
+      </w:r>
+      <w:proofErr w:type="spellStart"/>
+      <w:r>
+        <w:rPr>
+          <w:b/>
+          <w:bCs/>
+        </w:rPr>
+        <w:t>Supabase</w:t>
+      </w:r>
+      <w:proofErr w:type="spellEnd"/>
+      <w:r>
+        <w:rPr>
+          <w:b/>
+          <w:bCs/>
+        </w:rPr>
+        <w:t xml:space="preserve"> SQL editor</w:t>
+      </w:r>
+    </w:p>
+    <w:p>
+      <w:pPr>
+        <w:spacing w:after="120"/>
+        <w:rPr>
+          <w:b/>
+          <w:bCs/>
+        </w:rPr>
+      </w:pPr>
+      <w:r>
+        <w:rPr>
+          <w:b/>
+          <w:bCs/>
+        </w:rPr>
+        <w:t xml:space="preserve">UPDATE </w:t>
+      </w:r>
+      <w:proofErr w:type="spellStart"/>
+      <w:r>
+        <w:rPr>
+          <w:b/>
+          <w:bCs/>
+        </w:rPr>
+        <w:t>partner_brief_tokens</w:t>
+      </w:r>
+      <w:proofErr w:type="spellEnd"/>
+      <w:r>
+        <w:rPr>
+          <w:b/>
+          <w:bCs/>
+        </w:rPr>
+        <w:t xml:space="preserve"> SET </w:t>
+      </w:r>
+      <w:proofErr w:type="spellStart"/>
+      <w:r>
+        <w:rPr>
+          <w:b/>
+          <w:bCs/>
+        </w:rPr>
+        <w:t>partner_first_name</w:t>
+      </w:r>
+      <w:proofErr w:type="spellEnd"/>
+      <w:r>
+        <w:rPr>
+          <w:b/>
+          <w:bCs/>
+        </w:rPr>
+        <w:t xml:space="preserve"> = '</w:t>
+      </w:r>
+      <w:r>
+        <w:rPr>
+          <w:b/>
+          <w:bCs/>
+        </w:rPr>
+        <w:t>Chris</w:t>
+      </w:r>
+      <w:proofErr w:type="gramStart"/>
+      <w:r>
+        <w:rPr>
+          <w:b/>
+          <w:bCs/>
+        </w:rPr>
+        <w:t xml:space="preserve">',  </w:t>
+      </w:r>
+      <w:proofErr w:type="spellStart"/>
+      <w:r>
+        <w:rPr>
+          <w:b/>
+          <w:bCs/>
+        </w:rPr>
+        <w:t>partner</w:t>
+      </w:r>
+      <w:proofErr w:type="gramEnd"/>
+      <w:r>
+        <w:rPr>
+          <w:b/>
+          <w:bCs/>
+        </w:rPr>
+        <w:t>_name</w:t>
+      </w:r>
+      <w:proofErr w:type="spellEnd"/>
+      <w:r>
+        <w:rPr>
+          <w:b/>
+          <w:bCs/>
+        </w:rPr>
+        <w:t xml:space="preserve"> = '</w:t>
+      </w:r>
+      <w:r>
+        <w:rPr>
+          <w:b/>
+          <w:bCs/>
+        </w:rPr>
+        <w:t>Chris</w:t>
+      </w:r>
+      <w:r>
+        <w:rPr>
+          <w:b/>
+          <w:bCs/>
+        </w:rPr>
+        <w:t>'       WHERE token = '82ad0991e32f4887</w:t>
+      </w:r>
+      <w:proofErr w:type="gramStart"/>
+      <w:r>
+        <w:rPr>
+          <w:b/>
+          <w:bCs/>
+        </w:rPr>
+        <w:t>';</w:t>
+      </w:r>
+      <w:proofErr w:type="gramEnd"/>
+    </w:p>
+    <w:p>
+      <w:pPr>
+        <w:spacing w:after="120"/>
+        <w:rPr>
+          <w:b/>
+          <w:bCs/>
+        </w:rPr>
+      </w:pPr>
+      <w:r>
+        <w:rPr>
+          <w:b/>
+          <w:bCs/>
+        </w:rPr>
+        <w:t xml:space="preserve">UPDATE </w:t>
+      </w:r>
+      <w:proofErr w:type="spellStart"/>
+      <w:r>
+        <w:rPr>
+          <w:b/>
+          <w:bCs/>
+        </w:rPr>
+        <w:t>partner_brief_tokens</w:t>
+      </w:r>
+      <w:proofErr w:type="spellEnd"/>
+      <w:r>
+        <w:rPr>
+          <w:b/>
+          <w:bCs/>
+        </w:rPr>
+        <w:t xml:space="preserve"> SET </w:t>
+      </w:r>
+      <w:proofErr w:type="spellStart"/>
+      <w:r>
+        <w:rPr>
+          <w:b/>
+          <w:bCs/>
+        </w:rPr>
+        <w:t>partner_first_name</w:t>
+      </w:r>
+      <w:proofErr w:type="spellEnd"/>
+      <w:r>
+        <w:rPr>
+          <w:b/>
+          <w:bCs/>
+        </w:rPr>
+        <w:t xml:space="preserve"> = '</w:t>
+      </w:r>
+      <w:r>
+        <w:rPr>
+          <w:b/>
+          <w:bCs/>
+        </w:rPr>
+        <w:t>Will</w:t>
+      </w:r>
+      <w:r>
+        <w:rPr>
+          <w:b/>
+          <w:bCs/>
+        </w:rPr>
+        <w:t xml:space="preserve">', </w:t>
+      </w:r>
+      <w:proofErr w:type="spellStart"/>
+      <w:r>
+        <w:rPr>
+          <w:b/>
+          <w:bCs/>
+        </w:rPr>
+        <w:t>partner_name</w:t>
+      </w:r>
+      <w:proofErr w:type="spellEnd"/>
+      <w:r>
+        <w:rPr>
+          <w:b/>
+          <w:bCs/>
+        </w:rPr>
+        <w:t xml:space="preserve"> = '</w:t>
+      </w:r>
+      <w:r>
+        <w:rPr>
+          <w:b/>
+          <w:bCs/>
+        </w:rPr>
+        <w:t>Will</w:t>
+      </w:r>
+      <w:r>
+        <w:rPr>
+          <w:b/>
+          <w:bCs/>
+        </w:rPr>
+        <w:t>'      WHERE token = 'f857a6b79c934fd7</w:t>
+      </w:r>
+      <w:proofErr w:type="gramStart"/>
+      <w:r>
+        <w:rPr>
+          <w:b/>
+          <w:bCs/>
+        </w:rPr>
+        <w:t>';</w:t>
+      </w:r>
+      <w:proofErr w:type="gramEnd"/>
+    </w:p>
+    <w:p>
+      <w:pPr>
+        <w:spacing w:after="120"/>
+        <w:rPr>
+          <w:b/>
+          <w:bCs/>
+        </w:rPr>
+      </w:pPr>
+      <w:r>
+        <w:rPr>
+          <w:b/>
+          <w:bCs/>
+        </w:rPr>
+        <w:t xml:space="preserve">UPDATE </w:t>
+      </w:r>
+      <w:proofErr w:type="spellStart"/>
+      <w:r>
+        <w:rPr>
+          <w:b/>
+          <w:bCs/>
+        </w:rPr>
+        <w:t>partner_brief_tokens</w:t>
+      </w:r>
+      <w:proofErr w:type="spellEnd"/>
+      <w:r>
+        <w:rPr>
+          <w:b/>
+          <w:bCs/>
+        </w:rPr>
+        <w:t xml:space="preserve"> SET </w:t>
+      </w:r>
+      <w:proofErr w:type="spellStart"/>
+      <w:r>
+        <w:rPr>
+          <w:b/>
+          <w:bCs/>
+        </w:rPr>
+        <w:t>partner_first_name</w:t>
+      </w:r>
+      <w:proofErr w:type="spellEnd"/>
+      <w:r>
+        <w:rPr>
+          <w:b/>
+          <w:bCs/>
+        </w:rPr>
+        <w:t xml:space="preserve"> = 'Dana</w:t>
+      </w:r>
+      <w:proofErr w:type="gramStart"/>
+      <w:r>
+        <w:rPr>
+          <w:b/>
+          <w:bCs/>
+        </w:rPr>
+        <w:t xml:space="preserve">',   </w:t>
+      </w:r>
+      <w:proofErr w:type="spellStart"/>
+      <w:proofErr w:type="gramEnd"/>
+      <w:r>
+        <w:rPr>
+          <w:b/>
+          <w:bCs/>
+        </w:rPr>
+        <w:t>partner_name</w:t>
+      </w:r>
+      <w:proofErr w:type="spellEnd"/>
+      <w:r>
+        <w:rPr>
+          <w:b/>
+          <w:bCs/>
+        </w:rPr>
+        <w:t xml:space="preserve"> = 'Dana Flores'      WHERE token = '1d1e6555547d41ad</w:t>
+      </w:r>
+      <w:proofErr w:type="gramStart"/>
+      <w:r>
+        <w:rPr>
+          <w:b/>
+          <w:bCs/>
+        </w:rPr>
+        <w:t>';</w:t>
+      </w:r>
+      <w:proofErr w:type="gramEnd"/>
+    </w:p>
+    <w:p>
+      <w:pPr>
+        <w:spacing w:after="120"/>
+        <w:rPr>
+          <w:b/>
+          <w:bCs/>
+        </w:rPr>
+      </w:pPr>
+      <w:r>
+        <w:rPr>
+          <w:b/>
+          <w:bCs/>
+        </w:rPr>
+        <w:t xml:space="preserve">UPDATE </w:t>
+      </w:r>
+      <w:proofErr w:type="spellStart"/>
+      <w:r>
+        <w:rPr>
+          <w:b/>
+          <w:bCs/>
+        </w:rPr>
+        <w:t>partner_brief_tokens</w:t>
+      </w:r>
+      <w:proofErr w:type="spellEnd"/>
+      <w:r>
+        <w:rPr>
+          <w:b/>
+          <w:bCs/>
+        </w:rPr>
+        <w:t xml:space="preserve"> SET </w:t>
+      </w:r>
+      <w:proofErr w:type="spellStart"/>
+      <w:r>
+        <w:rPr>
+          <w:b/>
+          <w:bCs/>
+        </w:rPr>
+        <w:t>partner_first_name</w:t>
+      </w:r>
+      <w:proofErr w:type="spellEnd"/>
+      <w:r>
+        <w:rPr>
+          <w:b/>
+          <w:bCs/>
+        </w:rPr>
+        <w:t xml:space="preserve"> = 'James</w:t>
+      </w:r>
+      <w:proofErr w:type="gramStart"/>
+      <w:r>
+        <w:rPr>
+          <w:b/>
+          <w:bCs/>
+        </w:rPr>
+        <w:t xml:space="preserve">',  </w:t>
+      </w:r>
+      <w:proofErr w:type="spellStart"/>
+      <w:r>
+        <w:rPr>
+          <w:b/>
+          <w:bCs/>
+        </w:rPr>
+        <w:t>partner</w:t>
+      </w:r>
+      <w:proofErr w:type="gramEnd"/>
+      <w:r>
+        <w:rPr>
+          <w:b/>
+          <w:bCs/>
+        </w:rPr>
+        <w:t>_name</w:t>
+      </w:r>
+      <w:proofErr w:type="spellEnd"/>
+      <w:r>
+        <w:rPr>
+          <w:b/>
+          <w:bCs/>
+        </w:rPr>
+        <w:t xml:space="preserve"> = 'James Okafor'     WHERE token = '0ff7a7d1f0dd4a23</w:t>
+      </w:r>
+      <w:proofErr w:type="gramStart"/>
+      <w:r>
+        <w:rPr>
+          <w:b/>
+          <w:bCs/>
+        </w:rPr>
+        <w:t>';</w:t>
+      </w:r>
+      <w:proofErr w:type="gramEnd"/>
+    </w:p>
+    <w:p>
+      <w:pPr>
+        <w:spacing w:after="120"/>
+        <w:rPr>
+          <w:b/>
+          <w:bCs/>
+        </w:rPr>
+      </w:pPr>
+      <w:r>
+        <w:rPr>
+          <w:b/>
+          <w:bCs/>
+        </w:rPr>
+        <w:t xml:space="preserve">UPDATE </w:t>
+      </w:r>
+      <w:proofErr w:type="spellStart"/>
+      <w:r>
+        <w:rPr>
+          <w:b/>
+          <w:bCs/>
+        </w:rPr>
+        <w:t>partner_brief_tokens</w:t>
+      </w:r>
+      <w:proofErr w:type="spellEnd"/>
+      <w:r>
+        <w:rPr>
+          <w:b/>
+          <w:bCs/>
+        </w:rPr>
+        <w:t xml:space="preserve"> SET </w:t>
+      </w:r>
+      <w:proofErr w:type="spellStart"/>
+      <w:r>
+        <w:rPr>
+          <w:b/>
+          <w:bCs/>
+        </w:rPr>
+        <w:t>partner_first_name</w:t>
+      </w:r>
+      <w:proofErr w:type="spellEnd"/>
+      <w:r>
+        <w:rPr>
+          <w:b/>
+          <w:bCs/>
+        </w:rPr>
+        <w:t xml:space="preserve"> = 'Priya</w:t>
+      </w:r>
+      <w:proofErr w:type="gramStart"/>
+      <w:r>
+        <w:rPr>
+          <w:b/>
+          <w:bCs/>
+        </w:rPr>
+        <w:t xml:space="preserve">',  </w:t>
+      </w:r>
+      <w:proofErr w:type="spellStart"/>
+      <w:r>
+        <w:rPr>
+          <w:b/>
+          <w:bCs/>
+        </w:rPr>
+        <w:t>partner</w:t>
+      </w:r>
+      <w:proofErr w:type="gramEnd"/>
+      <w:r>
+        <w:rPr>
+          <w:b/>
+          <w:bCs/>
+        </w:rPr>
+        <w:t>_name</w:t>
+      </w:r>
+      <w:proofErr w:type="spellEnd"/>
+      <w:r>
+        <w:rPr>
+          <w:b/>
+          <w:bCs/>
+        </w:rPr>
+        <w:t xml:space="preserve"> = 'Priya Nair'       WHERE token = '87b26eace0a34266</w:t>
+      </w:r>
+      <w:proofErr w:type="gramStart"/>
+      <w:r>
+        <w:rPr>
+          <w:b/>
+          <w:bCs/>
+        </w:rPr>
+        <w:t>';</w:t>
+      </w:r>
+      <w:proofErr w:type="gramEnd"/>
+    </w:p>
+    <w:p>
+      <w:pPr>
+        <w:spacing w:after="120"/>
+        <w:rPr>
+          <w:b/>
+          <w:bCs/>
+        </w:rPr>
+      </w:pPr>
+      <w:r>
+        <w:rPr>
+          <w:b/>
+          <w:bCs/>
+        </w:rPr>
+        <w:t xml:space="preserve">UPDATE </w:t>
+      </w:r>
+      <w:proofErr w:type="spellStart"/>
+      <w:r>
+        <w:rPr>
+          <w:b/>
+          <w:bCs/>
+        </w:rPr>
+        <w:t>partner_brief_tokens</w:t>
+      </w:r>
+      <w:proofErr w:type="spellEnd"/>
+      <w:r>
+        <w:rPr>
+          <w:b/>
+          <w:bCs/>
+        </w:rPr>
+        <w:t xml:space="preserve"> SET </w:t>
+      </w:r>
+      <w:proofErr w:type="spellStart"/>
+      <w:r>
+        <w:rPr>
+          <w:b/>
+          <w:bCs/>
+        </w:rPr>
+        <w:t>partner_first_name</w:t>
+      </w:r>
+      <w:proofErr w:type="spellEnd"/>
+      <w:r>
+        <w:rPr>
+          <w:b/>
+          <w:bCs/>
+        </w:rPr>
+        <w:t xml:space="preserve"> = 'Elena</w:t>
+      </w:r>
+      <w:proofErr w:type="gramStart"/>
+      <w:r>
+        <w:rPr>
+          <w:b/>
+          <w:bCs/>
+        </w:rPr>
+        <w:t xml:space="preserve">',  </w:t>
+      </w:r>
+      <w:proofErr w:type="spellStart"/>
+      <w:r>
+        <w:rPr>
+          <w:b/>
+          <w:bCs/>
+        </w:rPr>
+        <w:t>partner</w:t>
+      </w:r>
+      <w:proofErr w:type="gramEnd"/>
+      <w:r>
+        <w:rPr>
+          <w:b/>
+          <w:bCs/>
+        </w:rPr>
+        <w:t>_name</w:t>
+      </w:r>
+      <w:proofErr w:type="spellEnd"/>
+      <w:r>
+        <w:rPr>
+          <w:b/>
+          <w:bCs/>
+        </w:rPr>
+        <w:t xml:space="preserve"> = 'Elena Vasquez'    WHERE token = '894c3dc6f5f74b42</w:t>
+      </w:r>
+      <w:proofErr w:type="gramStart"/>
+      <w:r>
+        <w:rPr>
+          <w:b/>
+          <w:bCs/>
+        </w:rPr>
+        <w:t>';</w:t>
+      </w:r>
+      <w:proofErr w:type="gramEnd"/>
+    </w:p>
+    <w:p>
+      <w:pPr>
+        <w:spacing w:after="120"/>
+        <w:rPr>
+          <w:b/>
+          <w:bCs/>
+        </w:rPr>
+      </w:pPr>
+      <w:r>
+        <w:rPr>
+          <w:b/>
+          <w:bCs/>
+        </w:rPr>
+        <w:t xml:space="preserve">UPDATE </w:t>
+      </w:r>
+      <w:proofErr w:type="spellStart"/>
+      <w:r>
+        <w:rPr>
+          <w:b/>
+          <w:bCs/>
+        </w:rPr>
+        <w:t>partner_brief_tokens</w:t>
+      </w:r>
+      <w:proofErr w:type="spellEnd"/>
+      <w:r>
+        <w:rPr>
+          <w:b/>
+          <w:bCs/>
+        </w:rPr>
+        <w:t xml:space="preserve"> SET </w:t>
+      </w:r>
+      <w:proofErr w:type="spellStart"/>
+      <w:r>
+        <w:rPr>
+          <w:b/>
+          <w:bCs/>
+        </w:rPr>
+        <w:t>partner_first_name</w:t>
+      </w:r>
+      <w:proofErr w:type="spellEnd"/>
+      <w:r>
+        <w:rPr>
+          <w:b/>
+          <w:bCs/>
+        </w:rPr>
+        <w:t xml:space="preserve"> = 'Tom</w:t>
+      </w:r>
+      <w:proofErr w:type="gramStart"/>
+      <w:r>
+        <w:rPr>
+          <w:b/>
+          <w:bCs/>
+        </w:rPr>
+        <w:t xml:space="preserve">',   </w:t>
+      </w:r>
+      <w:proofErr w:type="gramEnd"/>
+      <w:r>
+        <w:rPr>
+          <w:b/>
+          <w:bCs/>
+        </w:rPr>
+        <w:t xml:space="preserve"> </w:t>
+      </w:r>
+      <w:proofErr w:type="spellStart"/>
+      <w:r>
+        <w:rPr>
+          <w:b/>
+          <w:bCs/>
+        </w:rPr>
+        <w:t>partner_name</w:t>
+      </w:r>
+      <w:proofErr w:type="spellEnd"/>
+      <w:r>
+        <w:rPr>
+          <w:b/>
+          <w:bCs/>
+        </w:rPr>
+        <w:t xml:space="preserve"> = 'Tom Briggs'       WHERE token = '836b9a201ab34493</w:t>
+      </w:r>
+      <w:proofErr w:type="gramStart"/>
+      <w:r>
+        <w:rPr>
+          <w:b/>
+          <w:bCs/>
+        </w:rPr>
+        <w:t>';</w:t>
+      </w:r>
+      <w:proofErr w:type="gramEnd"/>
+    </w:p>
+    <w:p>
+      <w:pPr>
+        <w:spacing w:after="120"/>
+        <w:rPr>
+          <w:b/>
+          <w:bCs/>
+        </w:rPr>
+      </w:pPr>
     </w:p>
     <w:sectPr>
       <w:pgSz w:w="11906" w:h="16838"/>

</xml_diff>